<commit_message>
Onboarding guide: no GitHub account needed, Claude fetches the archive
Replaces the manual ZIP download with a single message the reader pastes,
which Claude acts on. Verified anonymous clone, ZIP download and raw reads all
work with credentials disabled, so no colleague needs a GitHub account.

Also fixes two copy-safety bugs: the repo URL and the git clone command were
wrapped across lines with leading whitespace, which breaks both.

Co-Authored-By: Claude Opus 5 <noreply@anthropic.com>
</commit_message>
<xml_diff>
--- a/report/Getting-Started-Country-Reports.docx
+++ b/report/Getting-Started-Country-Reports.docx
@@ -46,7 +46,7 @@
           <w:sz w:val="23"/>
           <w:szCs w:val="23"/>
         </w:rPr>
-        <w:t xml:space="preserve">We keep a complete archive of the State Department’s Country Reports on Human Rights Practices — 389 reports across the 2023 and 2024 editions. You can ask Claude questions about any of them. This takes about ten minutes to set up and costs nothing beyond your existing Claude account.</w:t>
+        <w:t xml:space="preserve">We keep a complete archive of the State Department’s Country Reports on Human Rights Practices — 389 reports across the 2023 and 2024 editions. You can ask Claude questions about any of them. Setting this up takes a minute or two and costs nothing beyond your existing Claude account.</w:t>
       </w:r>
     </w:p>
     <w:p>
@@ -73,11 +73,22 @@
       <w:r>
         <w:rPr>
           <w:rFonts w:ascii="Arial" w:cs="Arial" w:eastAsia="Arial" w:hAnsi="Arial"/>
-          <w:color w:val="12171D"/>
-          <w:sz w:val="21"/>
-          <w:szCs w:val="21"/>
-        </w:rPr>
-        <w:t xml:space="preserve">Three options. They all reach the same archive — the difference is how much you install.</w:t>
+          <w:b/>
+          <w:bCs/>
+          <w:color w:val="12171D"/>
+          <w:sz w:val="21"/>
+          <w:szCs w:val="21"/>
+        </w:rPr>
+        <w:t xml:space="preserve">You do not need a GitHub account, and you do not need to download anything by hand. </w:t>
+      </w:r>
+      <w:r>
+        <w:rPr>
+          <w:rFonts w:ascii="Arial" w:cs="Arial" w:eastAsia="Arial" w:hAnsi="Arial"/>
+          <w:color w:val="12171D"/>
+          <w:sz w:val="21"/>
+          <w:szCs w:val="21"/>
+        </w:rPr>
+        <w:t xml:space="preserve">The archive is public, so Claude can fetch it for you. All three options below reach the same archive — the difference is only how much you install.</w:t>
       </w:r>
     </w:p>
     <w:tbl>
@@ -190,7 +201,7 @@
                 <w:sz w:val="19"/>
                 <w:szCs w:val="19"/>
               </w:rPr>
-              <w:t xml:space="preserve">To install</w:t>
+              <w:t xml:space="preserve">You need</w:t>
             </w:r>
           </w:p>
         </w:tc>
@@ -222,7 +233,7 @@
                 <w:sz w:val="19"/>
                 <w:szCs w:val="19"/>
               </w:rPr>
-              <w:t xml:space="preserve">Claude on the web</w:t>
+              <w:t xml:space="preserve">Claude desktop app</w:t>
             </w:r>
           </w:p>
         </w:tc>
@@ -252,7 +263,7 @@
                 <w:sz w:val="19"/>
                 <w:szCs w:val="19"/>
               </w:rPr>
-              <w:t xml:space="preserve">Most people. Nothing to set up.</w:t>
+              <w:t xml:space="preserve">Most people. Nothing to type but a sentence.</w:t>
             </w:r>
           </w:p>
         </w:tc>
@@ -282,7 +293,7 @@
                 <w:sz w:val="19"/>
                 <w:szCs w:val="19"/>
               </w:rPr>
-              <w:t xml:space="preserve">Nothing</w:t>
+              <w:t xml:space="preserve">The Claude app</w:t>
             </w:r>
           </w:p>
         </w:tc>
@@ -314,7 +325,7 @@
                 <w:sz w:val="19"/>
                 <w:szCs w:val="19"/>
               </w:rPr>
-              <w:t xml:space="preserve">Claude desktop app</w:t>
+              <w:t xml:space="preserve">Claude on the web</w:t>
             </w:r>
           </w:p>
         </w:tc>
@@ -344,7 +355,7 @@
                 <w:sz w:val="19"/>
                 <w:szCs w:val="19"/>
               </w:rPr>
-              <w:t xml:space="preserve">If you already use it for other work</w:t>
+              <w:t xml:space="preserve">If you would rather not install anything</w:t>
             </w:r>
           </w:p>
         </w:tc>
@@ -374,7 +385,7 @@
                 <w:sz w:val="19"/>
                 <w:szCs w:val="19"/>
               </w:rPr>
-              <w:t xml:space="preserve">The app</w:t>
+              <w:t xml:space="preserve">A browser</w:t>
             </w:r>
           </w:p>
         </w:tc>
@@ -482,31 +493,6 @@
     </w:p>
     <w:p>
       <w:pPr>
-        <w:spacing w:after="170" w:line="288"/>
-      </w:pPr>
-      <w:r>
-        <w:rPr>
-          <w:rFonts w:ascii="Arial" w:cs="Arial" w:eastAsia="Arial" w:hAnsi="Arial"/>
-          <w:b/>
-          <w:bCs/>
-          <w:color w:val="12171D"/>
-          <w:sz w:val="21"/>
-          <w:szCs w:val="21"/>
-        </w:rPr>
-        <w:t xml:space="preserve">If you are not sure, use the web option. </w:t>
-      </w:r>
-      <w:r>
-        <w:rPr>
-          <w:rFonts w:ascii="Arial" w:cs="Arial" w:eastAsia="Arial" w:hAnsi="Arial"/>
-          <w:color w:val="12171D"/>
-          <w:sz w:val="21"/>
-          <w:szCs w:val="21"/>
-        </w:rPr>
-        <w:t xml:space="preserve">It needs no installation and does everything the others do for asking questions.</w:t>
-      </w:r>
-    </w:p>
-    <w:p>
-      <w:pPr>
         <w:pStyle w:val="Heading1"/>
         <w:spacing w:after="150" w:before="400"/>
       </w:pPr>
@@ -519,7 +505,83 @@
           <w:sz w:val="30"/>
           <w:szCs w:val="30"/>
         </w:rPr>
-        <w:t xml:space="preserve">Option 1 — Claude on the web</w:t>
+        <w:t xml:space="preserve">The one thing to copy</w:t>
+      </w:r>
+    </w:p>
+    <w:p>
+      <w:pPr>
+        <w:spacing w:after="170" w:line="288"/>
+      </w:pPr>
+      <w:r>
+        <w:rPr>
+          <w:rFonts w:ascii="Arial" w:cs="Arial" w:eastAsia="Arial" w:hAnsi="Arial"/>
+          <w:color w:val="12171D"/>
+          <w:sz w:val="21"/>
+          <w:szCs w:val="21"/>
+        </w:rPr>
+        <w:t xml:space="preserve">Every option below works the same way: start a Claude session and paste this as your first message.</w:t>
+      </w:r>
+    </w:p>
+    <w:p>
+      <w:pPr>
+        <w:pBdr>
+          <w:left w:val="single" w:color="1163A0" w:sz="12"/>
+        </w:pBdr>
+        <w:shd w:fill="F4F6F8" w:color="auto" w:val="clear"/>
+        <w:spacing w:after="160" w:before="80"/>
+        <w:ind w:left="172" w:right="172"/>
+      </w:pPr>
+      <w:r>
+        <w:rPr>
+          <w:rFonts w:ascii="Consolas" w:cs="Consolas" w:eastAsia="Consolas" w:hAnsi="Consolas"/>
+          <w:color w:val="12171D"/>
+          <w:sz w:val="16"/>
+          <w:szCs w:val="16"/>
+        </w:rPr>
+        <w:t xml:space="preserve">Please clone this repository and then tell me what I can do with it:</w:t>
+      </w:r>
+      <w:r>
+        <w:br/>
+      </w:r>
+      <w:r>
+        <w:rPr>
+          <w:rFonts w:ascii="Consolas" w:cs="Consolas" w:eastAsia="Consolas" w:hAnsi="Consolas"/>
+          <w:color w:val="12171D"/>
+          <w:sz w:val="16"/>
+          <w:szCs w:val="16"/>
+        </w:rPr>
+        <w:t xml:space="preserve">https://github.com/Human-Rights-First-Innovation-Lab/country-reports-archive</w:t>
+      </w:r>
+    </w:p>
+    <w:p>
+      <w:pPr>
+        <w:spacing w:after="170" w:line="288"/>
+      </w:pPr>
+      <w:r>
+        <w:rPr>
+          <w:rFonts w:ascii="Arial" w:cs="Arial" w:eastAsia="Arial" w:hAnsi="Arial"/>
+          <w:color w:val="12171D"/>
+          <w:sz w:val="21"/>
+          <w:szCs w:val="21"/>
+        </w:rPr>
+        <w:t xml:space="preserve">Claude will download the archive and read its instructions, then tell you what is available. That is the entire setup. Everything after this page is detail.</w:t>
+      </w:r>
+    </w:p>
+    <w:p>
+      <w:pPr>
+        <w:pStyle w:val="Heading1"/>
+        <w:spacing w:after="150" w:before="400"/>
+      </w:pPr>
+      <w:r>
+        <w:rPr>
+          <w:rFonts w:ascii="Georgia" w:cs="Georgia" w:eastAsia="Georgia" w:hAnsi="Georgia"/>
+          <w:b/>
+          <w:bCs/>
+          <w:color w:val="12171D"/>
+          <w:sz w:val="30"/>
+          <w:szCs w:val="30"/>
+        </w:rPr>
+        <w:t xml:space="preserve">Option 1 — Claude desktop app</w:t>
       </w:r>
     </w:p>
     <w:p>
@@ -538,27 +600,7 @@
           <w:sz w:val="21"/>
           <w:szCs w:val="21"/>
         </w:rPr>
-        <w:t xml:space="preserve">Go to </w:t>
-      </w:r>
-      <w:r>
-        <w:rPr>
-          <w:rFonts w:ascii="Arial" w:cs="Arial" w:eastAsia="Arial" w:hAnsi="Arial"/>
-          <w:b/>
-          <w:bCs/>
-          <w:color w:val="1163A0"/>
-          <w:sz w:val="21"/>
-          <w:szCs w:val="21"/>
-        </w:rPr>
-        <w:t xml:space="preserve">claude.ai/code</w:t>
-      </w:r>
-      <w:r>
-        <w:rPr>
-          <w:rFonts w:ascii="Arial" w:cs="Arial" w:eastAsia="Arial" w:hAnsi="Arial"/>
-          <w:color w:val="12171D"/>
-          <w:sz w:val="21"/>
-          <w:szCs w:val="21"/>
-        </w:rPr>
-        <w:t xml:space="preserve"> and sign in with your Human Rights First account.</w:t>
+        <w:t xml:space="preserve">Open the Claude app and start a session in the Code tab.</w:t>
       </w:r>
     </w:p>
     <w:p>
@@ -577,7 +619,178 @@
           <w:sz w:val="21"/>
           <w:szCs w:val="21"/>
         </w:rPr>
-        <w:t xml:space="preserve">Connect the archive repository when prompted for a repository to work in:</w:t>
+        <w:t xml:space="preserve">When it asks for a folder, pick any empty folder — a new one on your Desktop is fine. The archive will be downloaded into it.</w:t>
+      </w:r>
+    </w:p>
+    <w:p>
+      <w:pPr>
+        <w:pStyle w:val="ListParagraph"/>
+        <w:numPr>
+          <w:ilvl w:val="0"/>
+          <w:numId w:val="2"/>
+        </w:numPr>
+        <w:spacing w:after="110"/>
+      </w:pPr>
+      <w:r>
+        <w:rPr>
+          <w:rFonts w:ascii="Arial" w:cs="Arial" w:eastAsia="Arial" w:hAnsi="Arial"/>
+          <w:color w:val="12171D"/>
+          <w:sz w:val="21"/>
+          <w:szCs w:val="21"/>
+        </w:rPr>
+        <w:t xml:space="preserve">Paste the message above.</w:t>
+      </w:r>
+    </w:p>
+    <w:p>
+      <w:pPr>
+        <w:spacing w:after="170" w:line="288"/>
+      </w:pPr>
+      <w:r>
+        <w:rPr>
+          <w:rFonts w:ascii="Arial" w:cs="Arial" w:eastAsia="Arial" w:hAnsi="Arial"/>
+          <w:i/>
+          <w:iCs/>
+          <w:color w:val="5B6673"/>
+          <w:sz w:val="19"/>
+          <w:szCs w:val="19"/>
+        </w:rPr>
+        <w:t xml:space="preserve">Claude downloads the archive itself. You do not need to visit GitHub, create an account, or unzip anything.</w:t>
+      </w:r>
+    </w:p>
+    <w:p>
+      <w:pPr>
+        <w:pStyle w:val="Heading1"/>
+        <w:spacing w:after="150" w:before="400"/>
+      </w:pPr>
+      <w:r>
+        <w:rPr>
+          <w:rFonts w:ascii="Georgia" w:cs="Georgia" w:eastAsia="Georgia" w:hAnsi="Georgia"/>
+          <w:b/>
+          <w:bCs/>
+          <w:color w:val="12171D"/>
+          <w:sz w:val="30"/>
+          <w:szCs w:val="30"/>
+        </w:rPr>
+        <w:t xml:space="preserve">Option 2 — Claude on the web</w:t>
+      </w:r>
+    </w:p>
+    <w:p>
+      <w:pPr>
+        <w:pStyle w:val="ListParagraph"/>
+        <w:numPr>
+          <w:ilvl w:val="0"/>
+          <w:numId w:val="3"/>
+        </w:numPr>
+        <w:spacing w:after="110"/>
+      </w:pPr>
+      <w:r>
+        <w:rPr>
+          <w:rFonts w:ascii="Arial" w:cs="Arial" w:eastAsia="Arial" w:hAnsi="Arial"/>
+          <w:color w:val="12171D"/>
+          <w:sz w:val="21"/>
+          <w:szCs w:val="21"/>
+        </w:rPr>
+        <w:t xml:space="preserve">Go to </w:t>
+      </w:r>
+      <w:r>
+        <w:rPr>
+          <w:rFonts w:ascii="Arial" w:cs="Arial" w:eastAsia="Arial" w:hAnsi="Arial"/>
+          <w:b/>
+          <w:bCs/>
+          <w:color w:val="1163A0"/>
+          <w:sz w:val="21"/>
+          <w:szCs w:val="21"/>
+        </w:rPr>
+        <w:t xml:space="preserve">claude.ai/code</w:t>
+      </w:r>
+      <w:r>
+        <w:rPr>
+          <w:rFonts w:ascii="Arial" w:cs="Arial" w:eastAsia="Arial" w:hAnsi="Arial"/>
+          <w:color w:val="12171D"/>
+          <w:sz w:val="21"/>
+          <w:szCs w:val="21"/>
+        </w:rPr>
+        <w:t xml:space="preserve"> and sign in with your Human Rights First account.</w:t>
+      </w:r>
+    </w:p>
+    <w:p>
+      <w:pPr>
+        <w:pStyle w:val="ListParagraph"/>
+        <w:numPr>
+          <w:ilvl w:val="0"/>
+          <w:numId w:val="3"/>
+        </w:numPr>
+        <w:spacing w:after="110"/>
+      </w:pPr>
+      <w:r>
+        <w:rPr>
+          <w:rFonts w:ascii="Arial" w:cs="Arial" w:eastAsia="Arial" w:hAnsi="Arial"/>
+          <w:color w:val="12171D"/>
+          <w:sz w:val="21"/>
+          <w:szCs w:val="21"/>
+        </w:rPr>
+        <w:t xml:space="preserve">Paste the message above.</w:t>
+      </w:r>
+    </w:p>
+    <w:p>
+      <w:pPr>
+        <w:spacing w:after="170" w:line="288"/>
+      </w:pPr>
+      <w:r>
+        <w:rPr>
+          <w:rFonts w:ascii="Arial" w:cs="Arial" w:eastAsia="Arial" w:hAnsi="Arial"/>
+          <w:b/>
+          <w:bCs/>
+          <w:color w:val="12171D"/>
+          <w:sz w:val="21"/>
+          <w:szCs w:val="21"/>
+        </w:rPr>
+        <w:t xml:space="preserve">If the web version asks you to connect a GitHub account, stop — do not create one. </w:t>
+      </w:r>
+      <w:r>
+        <w:rPr>
+          <w:rFonts w:ascii="Arial" w:cs="Arial" w:eastAsia="Arial" w:hAnsi="Arial"/>
+          <w:color w:val="12171D"/>
+          <w:sz w:val="21"/>
+          <w:szCs w:val="21"/>
+        </w:rPr>
+        <w:t xml:space="preserve">Use Option 1 or Option 3 instead, which need no GitHub account at all.</w:t>
+      </w:r>
+    </w:p>
+    <w:p>
+      <w:pPr>
+        <w:pStyle w:val="Heading1"/>
+        <w:spacing w:after="150" w:before="400"/>
+      </w:pPr>
+      <w:r>
+        <w:rPr>
+          <w:rFonts w:ascii="Georgia" w:cs="Georgia" w:eastAsia="Georgia" w:hAnsi="Georgia"/>
+          <w:b/>
+          <w:bCs/>
+          <w:color w:val="12171D"/>
+          <w:sz w:val="30"/>
+          <w:szCs w:val="30"/>
+        </w:rPr>
+        <w:t xml:space="preserve">Option 3 — Terminal</w:t>
+      </w:r>
+    </w:p>
+    <w:p>
+      <w:pPr>
+        <w:pStyle w:val="ListParagraph"/>
+        <w:numPr>
+          <w:ilvl w:val="0"/>
+          <w:numId w:val="4"/>
+        </w:numPr>
+        <w:spacing w:after="110"/>
+      </w:pPr>
+      <w:r>
+        <w:rPr>
+          <w:rFonts w:ascii="Arial" w:cs="Arial" w:eastAsia="Arial" w:hAnsi="Arial"/>
+          <w:color w:val="12171D"/>
+          <w:sz w:val="21"/>
+          <w:szCs w:val="21"/>
+        </w:rPr>
+        <w:t xml:space="preserve">Download the archive. It is public, so no credentials are needed:</w:t>
       </w:r>
     </w:p>
     <w:p>
@@ -593,156 +806,22 @@
         <w:rPr>
           <w:rFonts w:ascii="Consolas" w:cs="Consolas" w:eastAsia="Consolas" w:hAnsi="Consolas"/>
           <w:color w:val="12171D"/>
-          <w:sz w:val="18"/>
-          <w:szCs w:val="18"/>
-        </w:rPr>
-        <w:t xml:space="preserve">Human-Rights-First-Innovation-Lab/country-reports-archive</w:t>
-      </w:r>
-    </w:p>
-    <w:p>
-      <w:pPr>
-        <w:pStyle w:val="ListParagraph"/>
-        <w:numPr>
-          <w:ilvl w:val="0"/>
-          <w:numId w:val="2"/>
-        </w:numPr>
-        <w:spacing w:after="110"/>
-      </w:pPr>
-      <w:r>
-        <w:rPr>
-          <w:rFonts w:ascii="Arial" w:cs="Arial" w:eastAsia="Arial" w:hAnsi="Arial"/>
-          <w:color w:val="12171D"/>
-          <w:sz w:val="21"/>
-          <w:szCs w:val="21"/>
-        </w:rPr>
-        <w:t xml:space="preserve">Ask your first question (see below). That is the whole setup.</w:t>
-      </w:r>
-    </w:p>
-    <w:p>
-      <w:pPr>
-        <w:spacing w:after="170" w:line="288"/>
-      </w:pPr>
-      <w:r>
-        <w:rPr>
-          <w:rFonts w:ascii="Arial" w:cs="Arial" w:eastAsia="Arial" w:hAnsi="Arial"/>
-          <w:i/>
-          <w:iCs/>
-          <w:color w:val="5B6673"/>
-          <w:sz w:val="19"/>
-          <w:szCs w:val="19"/>
-        </w:rPr>
-        <w:t xml:space="preserve">The exact wording of the buttons may differ slightly from this guide as the interface changes — you are looking for the option to open or connect a GitHub repository.</w:t>
-      </w:r>
-    </w:p>
-    <w:p>
-      <w:pPr>
-        <w:pStyle w:val="Heading1"/>
-        <w:spacing w:after="150" w:before="400"/>
-      </w:pPr>
-      <w:r>
-        <w:rPr>
-          <w:rFonts w:ascii="Georgia" w:cs="Georgia" w:eastAsia="Georgia" w:hAnsi="Georgia"/>
-          <w:b/>
-          <w:bCs/>
-          <w:color w:val="12171D"/>
-          <w:sz w:val="30"/>
-          <w:szCs w:val="30"/>
-        </w:rPr>
-        <w:t xml:space="preserve">Option 2 — Claude desktop app</w:t>
-      </w:r>
-    </w:p>
-    <w:p>
-      <w:pPr>
-        <w:pStyle w:val="ListParagraph"/>
-        <w:numPr>
-          <w:ilvl w:val="0"/>
-          <w:numId w:val="3"/>
-        </w:numPr>
-        <w:spacing w:after="110"/>
-      </w:pPr>
-      <w:r>
-        <w:rPr>
-          <w:rFonts w:ascii="Arial" w:cs="Arial" w:eastAsia="Arial" w:hAnsi="Arial"/>
-          <w:color w:val="12171D"/>
-          <w:sz w:val="21"/>
-          <w:szCs w:val="21"/>
-        </w:rPr>
-        <w:t xml:space="preserve">Open the Claude app and start a session in the Code tab.</w:t>
-      </w:r>
-    </w:p>
-    <w:p>
-      <w:pPr>
-        <w:pStyle w:val="ListParagraph"/>
-        <w:numPr>
-          <w:ilvl w:val="0"/>
-          <w:numId w:val="3"/>
-        </w:numPr>
-        <w:spacing w:after="110"/>
-      </w:pPr>
-      <w:r>
-        <w:rPr>
-          <w:rFonts w:ascii="Arial" w:cs="Arial" w:eastAsia="Arial" w:hAnsi="Arial"/>
-          <w:color w:val="12171D"/>
-          <w:sz w:val="21"/>
-          <w:szCs w:val="21"/>
-        </w:rPr>
-        <w:t xml:space="preserve">Choose the folder containing the archive. If you do not have it yet, download it from </w:t>
-      </w:r>
-      <w:r>
-        <w:rPr>
-          <w:rFonts w:ascii="Arial" w:cs="Arial" w:eastAsia="Arial" w:hAnsi="Arial"/>
-          <w:b/>
-          <w:bCs/>
-          <w:color w:val="1163A0"/>
-          <w:sz w:val="21"/>
-          <w:szCs w:val="21"/>
-        </w:rPr>
-        <w:t xml:space="preserve">github.com/Human-Rights-First-Innovation-Lab/country-reports-archive</w:t>
-      </w:r>
-      <w:r>
-        <w:rPr>
-          <w:rFonts w:ascii="Arial" w:cs="Arial" w:eastAsia="Arial" w:hAnsi="Arial"/>
-          <w:color w:val="12171D"/>
-          <w:sz w:val="21"/>
-          <w:szCs w:val="21"/>
-        </w:rPr>
-        <w:t xml:space="preserve"> — use the green Code button, then Download ZIP, and unzip it somewhere you will remember.</w:t>
-      </w:r>
-    </w:p>
-    <w:p>
-      <w:pPr>
-        <w:pStyle w:val="ListParagraph"/>
-        <w:numPr>
-          <w:ilvl w:val="0"/>
-          <w:numId w:val="3"/>
-        </w:numPr>
-        <w:spacing w:after="110"/>
-      </w:pPr>
-      <w:r>
-        <w:rPr>
-          <w:rFonts w:ascii="Arial" w:cs="Arial" w:eastAsia="Arial" w:hAnsi="Arial"/>
-          <w:color w:val="12171D"/>
-          <w:sz w:val="21"/>
-          <w:szCs w:val="21"/>
-        </w:rPr>
-        <w:t xml:space="preserve">Ask your first question.</w:t>
-      </w:r>
-    </w:p>
-    <w:p>
-      <w:pPr>
-        <w:pStyle w:val="Heading1"/>
-        <w:spacing w:after="150" w:before="400"/>
-      </w:pPr>
-      <w:r>
-        <w:rPr>
-          <w:rFonts w:ascii="Georgia" w:cs="Georgia" w:eastAsia="Georgia" w:hAnsi="Georgia"/>
-          <w:b/>
-          <w:bCs/>
-          <w:color w:val="12171D"/>
-          <w:sz w:val="30"/>
-          <w:szCs w:val="30"/>
-        </w:rPr>
-        <w:t xml:space="preserve">Option 3 — Terminal</w:t>
+          <w:sz w:val="16"/>
+          <w:szCs w:val="16"/>
+        </w:rPr>
+        <w:t xml:space="preserve">git clone https://github.com/Human-Rights-First-Innovation-Lab/country-reports-archive.git</w:t>
+      </w:r>
+      <w:r>
+        <w:br/>
+      </w:r>
+      <w:r>
+        <w:rPr>
+          <w:rFonts w:ascii="Consolas" w:cs="Consolas" w:eastAsia="Consolas" w:hAnsi="Consolas"/>
+          <w:color w:val="12171D"/>
+          <w:sz w:val="16"/>
+          <w:szCs w:val="16"/>
+        </w:rPr>
+        <w:t xml:space="preserve">cd country-reports-archive</w:t>
       </w:r>
     </w:p>
     <w:p>
@@ -761,7 +840,7 @@
           <w:sz w:val="21"/>
           <w:szCs w:val="21"/>
         </w:rPr>
-        <w:t xml:space="preserve">Clone the archive. It is public, so you do not need any credentials:</w:t>
+        <w:t xml:space="preserve">Start Claude Code in that folder:</w:t>
       </w:r>
     </w:p>
     <w:p>
@@ -777,53 +856,35 @@
         <w:rPr>
           <w:rFonts w:ascii="Consolas" w:cs="Consolas" w:eastAsia="Consolas" w:hAnsi="Consolas"/>
           <w:color w:val="12171D"/>
-          <w:sz w:val="18"/>
-          <w:szCs w:val="18"/>
-        </w:rPr>
-        <w:t xml:space="preserve">git clone https://github.com/Human-Rights-First-Innovation-Lab/\</w:t>
-      </w:r>
-      <w:r>
-        <w:br/>
-      </w:r>
-      <w:r>
-        <w:rPr>
-          <w:rFonts w:ascii="Consolas" w:cs="Consolas" w:eastAsia="Consolas" w:hAnsi="Consolas"/>
-          <w:color w:val="12171D"/>
-          <w:sz w:val="18"/>
-          <w:szCs w:val="18"/>
-        </w:rPr>
-        <w:t xml:space="preserve">  country-reports-archive.git</w:t>
-      </w:r>
-      <w:r>
-        <w:br/>
-      </w:r>
-      <w:r>
-        <w:rPr>
-          <w:rFonts w:ascii="Consolas" w:cs="Consolas" w:eastAsia="Consolas" w:hAnsi="Consolas"/>
-          <w:color w:val="12171D"/>
-          <w:sz w:val="18"/>
-          <w:szCs w:val="18"/>
-        </w:rPr>
-        <w:t xml:space="preserve">cd country-reports-archive</w:t>
-      </w:r>
-    </w:p>
-    <w:p>
-      <w:pPr>
-        <w:pStyle w:val="ListParagraph"/>
-        <w:numPr>
-          <w:ilvl w:val="0"/>
-          <w:numId w:val="4"/>
-        </w:numPr>
-        <w:spacing w:after="110"/>
-      </w:pPr>
-      <w:r>
-        <w:rPr>
-          <w:rFonts w:ascii="Arial" w:cs="Arial" w:eastAsia="Arial" w:hAnsi="Arial"/>
-          <w:color w:val="12171D"/>
-          <w:sz w:val="21"/>
-          <w:szCs w:val="21"/>
-        </w:rPr>
-        <w:t xml:space="preserve">Start Claude Code in that folder:</w:t>
+          <w:sz w:val="16"/>
+          <w:szCs w:val="16"/>
+        </w:rPr>
+        <w:t xml:space="preserve">claude</w:t>
+      </w:r>
+    </w:p>
+    <w:p>
+      <w:pPr>
+        <w:spacing w:after="170" w:line="288"/>
+      </w:pPr>
+      <w:r>
+        <w:rPr>
+          <w:rFonts w:ascii="Arial" w:cs="Arial" w:eastAsia="Arial" w:hAnsi="Arial"/>
+          <w:b/>
+          <w:bCs/>
+          <w:color w:val="12171D"/>
+          <w:sz w:val="21"/>
+          <w:szCs w:val="21"/>
+        </w:rPr>
+        <w:t xml:space="preserve">Optional. </w:t>
+      </w:r>
+      <w:r>
+        <w:rPr>
+          <w:rFonts w:ascii="Arial" w:cs="Arial" w:eastAsia="Arial" w:hAnsi="Arial"/>
+          <w:color w:val="12171D"/>
+          <w:sz w:val="21"/>
+          <w:szCs w:val="21"/>
+        </w:rPr>
+        <w:t xml:space="preserve">Only needed if you want to run the analysis scripts yourself rather than asking Claude to:</w:t>
       </w:r>
     </w:p>
     <w:p>
@@ -839,35 +900,53 @@
         <w:rPr>
           <w:rFonts w:ascii="Consolas" w:cs="Consolas" w:eastAsia="Consolas" w:hAnsi="Consolas"/>
           <w:color w:val="12171D"/>
-          <w:sz w:val="18"/>
-          <w:szCs w:val="18"/>
-        </w:rPr>
-        <w:t xml:space="preserve">claude</w:t>
-      </w:r>
-    </w:p>
-    <w:p>
-      <w:pPr>
-        <w:spacing w:after="170" w:line="288"/>
-      </w:pPr>
-      <w:r>
-        <w:rPr>
-          <w:rFonts w:ascii="Arial" w:cs="Arial" w:eastAsia="Arial" w:hAnsi="Arial"/>
+          <w:sz w:val="16"/>
+          <w:szCs w:val="16"/>
+        </w:rPr>
+        <w:t xml:space="preserve">python3 -m venv .venv</w:t>
+      </w:r>
+      <w:r>
+        <w:br/>
+      </w:r>
+      <w:r>
+        <w:rPr>
+          <w:rFonts w:ascii="Consolas" w:cs="Consolas" w:eastAsia="Consolas" w:hAnsi="Consolas"/>
+          <w:color w:val="12171D"/>
+          <w:sz w:val="16"/>
+          <w:szCs w:val="16"/>
+        </w:rPr>
+        <w:t xml:space="preserve">.venv/bin/pip install -r requirements.txt</w:t>
+      </w:r>
+    </w:p>
+    <w:p>
+      <w:pPr>
+        <w:pStyle w:val="Heading1"/>
+        <w:spacing w:after="150" w:before="400"/>
+      </w:pPr>
+      <w:r>
+        <w:rPr>
+          <w:rFonts w:ascii="Georgia" w:cs="Georgia" w:eastAsia="Georgia" w:hAnsi="Georgia"/>
           <w:b/>
           <w:bCs/>
           <w:color w:val="12171D"/>
-          <w:sz w:val="21"/>
-          <w:szCs w:val="21"/>
-        </w:rPr>
-        <w:t xml:space="preserve">Optional. </w:t>
-      </w:r>
-      <w:r>
-        <w:rPr>
-          <w:rFonts w:ascii="Arial" w:cs="Arial" w:eastAsia="Arial" w:hAnsi="Arial"/>
-          <w:color w:val="12171D"/>
-          <w:sz w:val="21"/>
-          <w:szCs w:val="21"/>
-        </w:rPr>
-        <w:t xml:space="preserve">Only needed if you want to run the analysis scripts yourself rather than asking Claude to:</w:t>
+          <w:sz w:val="30"/>
+          <w:szCs w:val="30"/>
+        </w:rPr>
+        <w:t xml:space="preserve">Your first question</w:t>
+      </w:r>
+    </w:p>
+    <w:p>
+      <w:pPr>
+        <w:spacing w:after="170" w:line="288"/>
+      </w:pPr>
+      <w:r>
+        <w:rPr>
+          <w:rFonts w:ascii="Arial" w:cs="Arial" w:eastAsia="Arial" w:hAnsi="Arial"/>
+          <w:color w:val="12171D"/>
+          <w:sz w:val="21"/>
+          <w:szCs w:val="21"/>
+        </w:rPr>
+        <w:t xml:space="preserve">Whichever route you took, start by asking:</w:t>
       </w:r>
     </w:p>
     <w:p>
@@ -883,70 +962,8 @@
         <w:rPr>
           <w:rFonts w:ascii="Consolas" w:cs="Consolas" w:eastAsia="Consolas" w:hAnsi="Consolas"/>
           <w:color w:val="12171D"/>
-          <w:sz w:val="18"/>
-          <w:szCs w:val="18"/>
-        </w:rPr>
-        <w:t xml:space="preserve">python3 -m venv .venv</w:t>
-      </w:r>
-      <w:r>
-        <w:br/>
-      </w:r>
-      <w:r>
-        <w:rPr>
-          <w:rFonts w:ascii="Consolas" w:cs="Consolas" w:eastAsia="Consolas" w:hAnsi="Consolas"/>
-          <w:color w:val="12171D"/>
-          <w:sz w:val="18"/>
-          <w:szCs w:val="18"/>
-        </w:rPr>
-        <w:t xml:space="preserve">.venv/bin/pip install -r requirements.txt</w:t>
-      </w:r>
-    </w:p>
-    <w:p>
-      <w:pPr>
-        <w:pStyle w:val="Heading1"/>
-        <w:spacing w:after="150" w:before="400"/>
-      </w:pPr>
-      <w:r>
-        <w:rPr>
-          <w:rFonts w:ascii="Georgia" w:cs="Georgia" w:eastAsia="Georgia" w:hAnsi="Georgia"/>
-          <w:b/>
-          <w:bCs/>
-          <w:color w:val="12171D"/>
-          <w:sz w:val="30"/>
-          <w:szCs w:val="30"/>
-        </w:rPr>
-        <w:t xml:space="preserve">Your first question</w:t>
-      </w:r>
-    </w:p>
-    <w:p>
-      <w:pPr>
-        <w:spacing w:after="170" w:line="288"/>
-      </w:pPr>
-      <w:r>
-        <w:rPr>
-          <w:rFonts w:ascii="Arial" w:cs="Arial" w:eastAsia="Arial" w:hAnsi="Arial"/>
-          <w:color w:val="12171D"/>
-          <w:sz w:val="21"/>
-          <w:szCs w:val="21"/>
-        </w:rPr>
-        <w:t xml:space="preserve">Whichever route you took, start by asking:</w:t>
-      </w:r>
-    </w:p>
-    <w:p>
-      <w:pPr>
-        <w:pBdr>
-          <w:left w:val="single" w:color="1163A0" w:sz="12"/>
-        </w:pBdr>
-        <w:shd w:fill="F4F6F8" w:color="auto" w:val="clear"/>
-        <w:spacing w:after="160" w:before="80"/>
-        <w:ind w:left="172" w:right="172"/>
-      </w:pPr>
-      <w:r>
-        <w:rPr>
-          <w:rFonts w:ascii="Consolas" w:cs="Consolas" w:eastAsia="Consolas" w:hAnsi="Consolas"/>
-          <w:color w:val="12171D"/>
-          <w:sz w:val="18"/>
-          <w:szCs w:val="18"/>
+          <w:sz w:val="16"/>
+          <w:szCs w:val="16"/>
         </w:rPr>
         <w:t xml:space="preserve">What can I do with this repo?</w:t>
       </w:r>

</xml_diff>